<commit_message>
Complete Step 9: Dual-Channel Integration and GRU-D normalization
</commit_message>
<xml_diff>
--- a/Notes.docx
+++ b/Notes.docx
@@ -6237,6 +6237,9 @@
         <w:jc w:val="both"/>
       </w:pPr>
       <w:r>
+        <w:rPr>
+          <w:noProof/>
+        </w:rPr>
         <w:drawing>
           <wp:inline distT="0" distB="0" distL="0" distR="0" wp14:anchorId="0BC146F6" wp14:editId="272CA1C7">
             <wp:extent cx="5731510" cy="3606165"/>
@@ -6376,6 +6379,9 @@
         <w:jc w:val="both"/>
       </w:pPr>
       <w:r>
+        <w:rPr>
+          <w:noProof/>
+        </w:rPr>
         <w:lastRenderedPageBreak/>
         <w:drawing>
           <wp:inline distT="0" distB="0" distL="0" distR="0" wp14:anchorId="3DB80A34" wp14:editId="1D2DB391">
@@ -6490,6 +6496,9 @@
         <w:jc w:val="both"/>
       </w:pPr>
       <w:r>
+        <w:rPr>
+          <w:noProof/>
+        </w:rPr>
         <w:drawing>
           <wp:inline distT="0" distB="0" distL="0" distR="0" wp14:anchorId="3D005E1E" wp14:editId="5C78CBE7">
             <wp:extent cx="5731510" cy="2747645"/>
@@ -6533,6 +6542,9 @@
         <w:jc w:val="both"/>
       </w:pPr>
       <w:r>
+        <w:rPr>
+          <w:noProof/>
+        </w:rPr>
         <w:drawing>
           <wp:inline distT="0" distB="0" distL="0" distR="0" wp14:anchorId="701733FD" wp14:editId="53519A99">
             <wp:extent cx="5731510" cy="1708150"/>
@@ -6623,6 +6635,9 @@
         <w:jc w:val="both"/>
       </w:pPr>
       <w:r>
+        <w:rPr>
+          <w:noProof/>
+        </w:rPr>
         <w:drawing>
           <wp:inline distT="0" distB="0" distL="0" distR="0" wp14:anchorId="05593900" wp14:editId="51F48FE4">
             <wp:extent cx="5731510" cy="1445895"/>
@@ -6795,6 +6810,9 @@
         <w:jc w:val="both"/>
       </w:pPr>
       <w:r>
+        <w:rPr>
+          <w:noProof/>
+        </w:rPr>
         <w:lastRenderedPageBreak/>
         <w:drawing>
           <wp:inline distT="0" distB="0" distL="0" distR="0" wp14:anchorId="7261DC89" wp14:editId="4517E933">
@@ -6833,6 +6851,1080 @@
         </w:drawing>
       </w:r>
     </w:p>
+    <w:p>
+      <w:pPr>
+        <w:spacing w:before="60" w:after="80"/>
+        <w:jc w:val="both"/>
+      </w:pPr>
+    </w:p>
+    <w:p>
+      <w:pPr>
+        <w:spacing w:before="60" w:after="80"/>
+        <w:jc w:val="both"/>
+      </w:pPr>
+    </w:p>
+    <w:p>
+      <w:pPr>
+        <w:spacing w:before="100" w:beforeAutospacing="1" w:after="100" w:afterAutospacing="1"/>
+        <w:outlineLvl w:val="2"/>
+        <w:rPr>
+          <w:b/>
+          <w:bCs/>
+          <w:sz w:val="27"/>
+          <w:szCs w:val="27"/>
+        </w:rPr>
+      </w:pPr>
+      <w:r>
+        <w:rPr>
+          <w:b/>
+          <w:bCs/>
+          <w:sz w:val="27"/>
+          <w:szCs w:val="27"/>
+        </w:rPr>
+        <w:t>Step 9 — Dual-Channel Integration</w:t>
+      </w:r>
+    </w:p>
+    <w:p>
+      <w:pPr>
+        <w:spacing w:before="100" w:beforeAutospacing="1" w:after="100" w:afterAutospacing="1"/>
+        <w:rPr>
+          <w:sz w:val="24"/>
+          <w:szCs w:val="24"/>
+        </w:rPr>
+      </w:pPr>
+      <w:r>
+        <w:rPr>
+          <w:b/>
+          <w:bCs/>
+          <w:sz w:val="24"/>
+          <w:szCs w:val="24"/>
+        </w:rPr>
+        <w:t>What Was Built</w:t>
+      </w:r>
+    </w:p>
+    <w:p>
+      <w:pPr>
+        <w:spacing w:before="100" w:beforeAutospacing="1" w:after="100" w:afterAutospacing="1"/>
+        <w:rPr>
+          <w:sz w:val="24"/>
+          <w:szCs w:val="24"/>
+        </w:rPr>
+      </w:pPr>
+      <w:r>
+        <w:rPr>
+          <w:sz w:val="24"/>
+          <w:szCs w:val="24"/>
+        </w:rPr>
+        <w:t xml:space="preserve">An integration script that fuses Channel 1 (Kalman Filter) and Channel 2 (GRU-D) outputs into a single fully-imputed window array </w:t>
+      </w:r>
+      <w:r>
+        <w:rPr>
+          <w:rFonts w:ascii="Courier New" w:hAnsi="Courier New" w:cs="Courier New"/>
+        </w:rPr>
+        <w:t>X_fully_imputed</w:t>
+      </w:r>
+      <w:r>
+        <w:rPr>
+          <w:sz w:val="24"/>
+          <w:szCs w:val="24"/>
+        </w:rPr>
+        <w:t xml:space="preserve"> for every window in </w:t>
+      </w:r>
+      <w:r>
+        <w:rPr>
+          <w:rFonts w:ascii="Courier New" w:hAnsi="Courier New" w:cs="Courier New"/>
+        </w:rPr>
+        <w:t>data_corrupted/</w:t>
+      </w:r>
+      <w:r>
+        <w:rPr>
+          <w:sz w:val="24"/>
+          <w:szCs w:val="24"/>
+        </w:rPr>
+        <w:t>.</w:t>
+      </w:r>
+    </w:p>
+    <w:p>
+      <w:pPr>
+        <w:spacing w:before="100" w:beforeAutospacing="1" w:after="100" w:afterAutospacing="1"/>
+        <w:rPr>
+          <w:sz w:val="24"/>
+          <w:szCs w:val="24"/>
+        </w:rPr>
+      </w:pPr>
+      <w:r>
+        <w:rPr>
+          <w:b/>
+          <w:bCs/>
+          <w:sz w:val="24"/>
+          <w:szCs w:val="24"/>
+        </w:rPr>
+        <w:t>Integration Sequence Per Window</w:t>
+      </w:r>
+    </w:p>
+    <w:p>
+      <w:pPr>
+        <w:tabs>
+          <w:tab w:val="left" w:pos="916"/>
+          <w:tab w:val="left" w:pos="1832"/>
+          <w:tab w:val="left" w:pos="2748"/>
+          <w:tab w:val="left" w:pos="3664"/>
+          <w:tab w:val="left" w:pos="4580"/>
+          <w:tab w:val="left" w:pos="5496"/>
+          <w:tab w:val="left" w:pos="6412"/>
+          <w:tab w:val="left" w:pos="7328"/>
+          <w:tab w:val="left" w:pos="8244"/>
+          <w:tab w:val="left" w:pos="9160"/>
+          <w:tab w:val="left" w:pos="10076"/>
+          <w:tab w:val="left" w:pos="10992"/>
+          <w:tab w:val="left" w:pos="11908"/>
+          <w:tab w:val="left" w:pos="12824"/>
+          <w:tab w:val="left" w:pos="13740"/>
+          <w:tab w:val="left" w:pos="14656"/>
+        </w:tabs>
+        <w:rPr>
+          <w:rFonts w:ascii="var(--font-mono)" w:hAnsi="var(--font-mono)" w:cs="Courier New"/>
+          <w:color w:val="14181F"/>
+        </w:rPr>
+      </w:pPr>
+      <w:r>
+        <w:rPr>
+          <w:rFonts w:ascii="var(--font-mono)" w:hAnsi="var(--font-mono)" w:cs="Courier New"/>
+          <w:color w:val="14181F"/>
+        </w:rPr>
+        <w:t>X_ch1_imputed (cols 4,5 filled by KF)</w:t>
+      </w:r>
+    </w:p>
+    <w:p>
+      <w:pPr>
+        <w:tabs>
+          <w:tab w:val="left" w:pos="916"/>
+          <w:tab w:val="left" w:pos="1832"/>
+          <w:tab w:val="left" w:pos="2748"/>
+          <w:tab w:val="left" w:pos="3664"/>
+          <w:tab w:val="left" w:pos="4580"/>
+          <w:tab w:val="left" w:pos="5496"/>
+          <w:tab w:val="left" w:pos="6412"/>
+          <w:tab w:val="left" w:pos="7328"/>
+          <w:tab w:val="left" w:pos="8244"/>
+          <w:tab w:val="left" w:pos="9160"/>
+          <w:tab w:val="left" w:pos="10076"/>
+          <w:tab w:val="left" w:pos="10992"/>
+          <w:tab w:val="left" w:pos="11908"/>
+          <w:tab w:val="left" w:pos="12824"/>
+          <w:tab w:val="left" w:pos="13740"/>
+          <w:tab w:val="left" w:pos="14656"/>
+        </w:tabs>
+        <w:rPr>
+          <w:rFonts w:ascii="var(--font-mono)" w:hAnsi="var(--font-mono)" w:cs="Courier New"/>
+          <w:color w:val="14181F"/>
+        </w:rPr>
+      </w:pPr>
+      <w:r>
+        <w:rPr>
+          <w:rFonts w:ascii="var(--font-mono)" w:hAnsi="var(--font-mono)" w:cs="Courier New"/>
+          <w:color w:val="14181F"/>
+        </w:rPr>
+        <w:t xml:space="preserve">    → Extract cols 0-3 → normalise → zero-out missing → GRU-D inference</w:t>
+      </w:r>
+    </w:p>
+    <w:p>
+      <w:pPr>
+        <w:tabs>
+          <w:tab w:val="left" w:pos="916"/>
+          <w:tab w:val="left" w:pos="1832"/>
+          <w:tab w:val="left" w:pos="2748"/>
+          <w:tab w:val="left" w:pos="3664"/>
+          <w:tab w:val="left" w:pos="4580"/>
+          <w:tab w:val="left" w:pos="5496"/>
+          <w:tab w:val="left" w:pos="6412"/>
+          <w:tab w:val="left" w:pos="7328"/>
+          <w:tab w:val="left" w:pos="8244"/>
+          <w:tab w:val="left" w:pos="9160"/>
+          <w:tab w:val="left" w:pos="10076"/>
+          <w:tab w:val="left" w:pos="10992"/>
+          <w:tab w:val="left" w:pos="11908"/>
+          <w:tab w:val="left" w:pos="12824"/>
+          <w:tab w:val="left" w:pos="13740"/>
+          <w:tab w:val="left" w:pos="14656"/>
+        </w:tabs>
+        <w:rPr>
+          <w:rFonts w:ascii="var(--font-mono)" w:hAnsi="var(--font-mono)" w:cs="Courier New"/>
+          <w:color w:val="14181F"/>
+        </w:rPr>
+      </w:pPr>
+      <w:r>
+        <w:rPr>
+          <w:rFonts w:ascii="var(--font-mono)" w:hAnsi="var(--font-mono)" w:cs="Courier New"/>
+          <w:color w:val="14181F"/>
+        </w:rPr>
+        <w:t xml:space="preserve">    → denormalise → write back to cols 0-3</w:t>
+      </w:r>
+    </w:p>
+    <w:p>
+      <w:pPr>
+        <w:tabs>
+          <w:tab w:val="left" w:pos="916"/>
+          <w:tab w:val="left" w:pos="1832"/>
+          <w:tab w:val="left" w:pos="2748"/>
+          <w:tab w:val="left" w:pos="3664"/>
+          <w:tab w:val="left" w:pos="4580"/>
+          <w:tab w:val="left" w:pos="5496"/>
+          <w:tab w:val="left" w:pos="6412"/>
+          <w:tab w:val="left" w:pos="7328"/>
+          <w:tab w:val="left" w:pos="8244"/>
+          <w:tab w:val="left" w:pos="9160"/>
+          <w:tab w:val="left" w:pos="10076"/>
+          <w:tab w:val="left" w:pos="10992"/>
+          <w:tab w:val="left" w:pos="11908"/>
+          <w:tab w:val="left" w:pos="12824"/>
+          <w:tab w:val="left" w:pos="13740"/>
+          <w:tab w:val="left" w:pos="14656"/>
+        </w:tabs>
+        <w:rPr>
+          <w:rFonts w:ascii="var(--font-mono)" w:hAnsi="var(--font-mono)" w:cs="Courier New"/>
+          <w:color w:val="14181F"/>
+        </w:rPr>
+      </w:pPr>
+      <w:r>
+        <w:rPr>
+          <w:rFonts w:ascii="var(--font-mono)" w:hAnsi="var(--font-mono)" w:cs="Courier New"/>
+          <w:color w:val="14181F"/>
+        </w:rPr>
+        <w:t xml:space="preserve">    → X_fully_imputed</w:t>
+      </w:r>
+    </w:p>
+    <w:p>
+      <w:pPr>
+        <w:spacing w:before="100" w:beforeAutospacing="1" w:after="100" w:afterAutospacing="1"/>
+        <w:rPr>
+          <w:sz w:val="24"/>
+          <w:szCs w:val="24"/>
+        </w:rPr>
+      </w:pPr>
+      <w:r>
+        <w:rPr>
+          <w:b/>
+          <w:bCs/>
+          <w:sz w:val="24"/>
+          <w:szCs w:val="24"/>
+        </w:rPr>
+        <w:t>Normalisation Pipeline for Channel 2 Inference</w:t>
+      </w:r>
+    </w:p>
+    <w:p>
+      <w:pPr>
+        <w:spacing w:before="100" w:beforeAutospacing="1" w:after="100" w:afterAutospacing="1"/>
+        <w:rPr>
+          <w:sz w:val="24"/>
+          <w:szCs w:val="24"/>
+        </w:rPr>
+      </w:pPr>
+      <w:r>
+        <w:rPr>
+          <w:sz w:val="24"/>
+          <w:szCs w:val="24"/>
+        </w:rPr>
+        <w:t>Five operations in exact order:</w:t>
+      </w:r>
+    </w:p>
+    <w:p>
+      <w:pPr>
+        <w:numPr>
+          <w:ilvl w:val="0"/>
+          <w:numId w:val="2"/>
+        </w:numPr>
+        <w:spacing w:before="100" w:beforeAutospacing="1" w:after="100" w:afterAutospacing="1"/>
+        <w:rPr>
+          <w:sz w:val="24"/>
+          <w:szCs w:val="24"/>
+        </w:rPr>
+      </w:pPr>
+      <w:r>
+        <w:rPr>
+          <w:sz w:val="24"/>
+          <w:szCs w:val="24"/>
+        </w:rPr>
+        <w:lastRenderedPageBreak/>
+        <w:t xml:space="preserve">Extract ego columns 0-3 from </w:t>
+      </w:r>
+      <w:r>
+        <w:rPr>
+          <w:rFonts w:ascii="Courier New" w:hAnsi="Courier New" w:cs="Courier New"/>
+        </w:rPr>
+        <w:t>X_ch1_imputed</w:t>
+      </w:r>
+    </w:p>
+    <w:p>
+      <w:pPr>
+        <w:numPr>
+          <w:ilvl w:val="0"/>
+          <w:numId w:val="2"/>
+        </w:numPr>
+        <w:spacing w:before="100" w:beforeAutospacing="1" w:after="100" w:afterAutospacing="1"/>
+        <w:rPr>
+          <w:sz w:val="24"/>
+          <w:szCs w:val="24"/>
+        </w:rPr>
+      </w:pPr>
+      <w:r>
+        <w:rPr>
+          <w:sz w:val="24"/>
+          <w:szCs w:val="24"/>
+        </w:rPr>
+        <w:t>Replace NaN with 0.0 (</w:t>
+      </w:r>
+      <w:r>
+        <w:rPr>
+          <w:rFonts w:ascii="Courier New" w:hAnsi="Courier New" w:cs="Courier New"/>
+        </w:rPr>
+        <w:t>nan_to_num</w:t>
+      </w:r>
+      <w:r>
+        <w:rPr>
+          <w:sz w:val="24"/>
+          <w:szCs w:val="24"/>
+        </w:rPr>
+        <w:t>)</w:t>
+      </w:r>
+    </w:p>
+    <w:p>
+      <w:pPr>
+        <w:numPr>
+          <w:ilvl w:val="0"/>
+          <w:numId w:val="2"/>
+        </w:numPr>
+        <w:spacing w:before="100" w:beforeAutospacing="1" w:after="100" w:afterAutospacing="1"/>
+        <w:rPr>
+          <w:sz w:val="24"/>
+          <w:szCs w:val="24"/>
+        </w:rPr>
+      </w:pPr>
+      <w:r>
+        <w:rPr>
+          <w:sz w:val="24"/>
+          <w:szCs w:val="24"/>
+        </w:rPr>
+        <w:t xml:space="preserve">Normalise: </w:t>
+      </w:r>
+      <w:r>
+        <w:rPr>
+          <w:rFonts w:ascii="Courier New" w:hAnsi="Courier New" w:cs="Courier New"/>
+        </w:rPr>
+        <w:t>(raw - scaler_mean) / scaler_std</w:t>
+      </w:r>
+    </w:p>
+    <w:p>
+      <w:pPr>
+        <w:numPr>
+          <w:ilvl w:val="0"/>
+          <w:numId w:val="2"/>
+        </w:numPr>
+        <w:spacing w:before="100" w:beforeAutospacing="1" w:after="100" w:afterAutospacing="1"/>
+        <w:rPr>
+          <w:sz w:val="24"/>
+          <w:szCs w:val="24"/>
+        </w:rPr>
+      </w:pPr>
+      <w:r>
+        <w:rPr>
+          <w:sz w:val="24"/>
+          <w:szCs w:val="24"/>
+        </w:rPr>
+        <w:t xml:space="preserve">Re-zero missing entries: </w:t>
+      </w:r>
+      <w:r>
+        <w:rPr>
+          <w:rFonts w:ascii="Courier New" w:hAnsi="Courier New" w:cs="Courier New"/>
+        </w:rPr>
+        <w:t>torch.where(mask==1, norm, zeros)</w:t>
+      </w:r>
+      <w:r>
+        <w:rPr>
+          <w:sz w:val="24"/>
+          <w:szCs w:val="24"/>
+        </w:rPr>
+        <w:t xml:space="preserve"> — critical because normalising 0.0 produces a nonzero shifted value</w:t>
+      </w:r>
+    </w:p>
+    <w:p>
+      <w:pPr>
+        <w:numPr>
+          <w:ilvl w:val="0"/>
+          <w:numId w:val="2"/>
+        </w:numPr>
+        <w:spacing w:before="100" w:beforeAutospacing="1" w:after="100" w:afterAutospacing="1"/>
+        <w:rPr>
+          <w:sz w:val="24"/>
+          <w:szCs w:val="24"/>
+        </w:rPr>
+      </w:pPr>
+      <w:r>
+        <w:rPr>
+          <w:sz w:val="24"/>
+          <w:szCs w:val="24"/>
+        </w:rPr>
+        <w:t xml:space="preserve">Pass to model, denormalise output, write to </w:t>
+      </w:r>
+      <w:r>
+        <w:rPr>
+          <w:rFonts w:ascii="Courier New" w:hAnsi="Courier New" w:cs="Courier New"/>
+        </w:rPr>
+        <w:t>X_fully_imputed[:, :, 0:4]</w:t>
+      </w:r>
+    </w:p>
+    <w:p>
+      <w:pPr>
+        <w:spacing w:before="100" w:beforeAutospacing="1" w:after="100" w:afterAutospacing="1"/>
+        <w:rPr>
+          <w:sz w:val="24"/>
+          <w:szCs w:val="24"/>
+        </w:rPr>
+      </w:pPr>
+      <w:r>
+        <w:rPr>
+          <w:b/>
+          <w:bCs/>
+          <w:sz w:val="24"/>
+          <w:szCs w:val="24"/>
+        </w:rPr>
+        <w:t>Why Re-zeroing Is Critical</w:t>
+      </w:r>
+    </w:p>
+    <w:p>
+      <w:pPr>
+        <w:spacing w:before="100" w:beforeAutospacing="1" w:after="100" w:afterAutospacing="1"/>
+        <w:rPr>
+          <w:sz w:val="24"/>
+          <w:szCs w:val="24"/>
+        </w:rPr>
+      </w:pPr>
+      <w:r>
+        <w:rPr>
+          <w:sz w:val="24"/>
+          <w:szCs w:val="24"/>
+        </w:rPr>
+        <w:t xml:space="preserve">After normalisation, a zero-filled missing entry becomes </w:t>
+      </w:r>
+      <w:r>
+        <w:rPr>
+          <w:rFonts w:ascii="Courier New" w:hAnsi="Courier New" w:cs="Courier New"/>
+        </w:rPr>
+        <w:t>(0 - mean) / std</w:t>
+      </w:r>
+      <w:r>
+        <w:rPr>
+          <w:sz w:val="24"/>
+          <w:szCs w:val="24"/>
+        </w:rPr>
+        <w:t xml:space="preserve"> — a nonzero value that misrepresents the missing position to the GRU-D. Re-applying the mask forces these back to 0.0 before the forward pass, consistent with how the model was trained.</w:t>
+      </w:r>
+    </w:p>
+    <w:p>
+      <w:pPr>
+        <w:spacing w:before="100" w:beforeAutospacing="1" w:after="100" w:afterAutospacing="1"/>
+        <w:rPr>
+          <w:sz w:val="24"/>
+          <w:szCs w:val="24"/>
+        </w:rPr>
+      </w:pPr>
+      <w:r>
+        <w:rPr>
+          <w:b/>
+          <w:bCs/>
+          <w:sz w:val="24"/>
+          <w:szCs w:val="24"/>
+        </w:rPr>
+        <w:t>Column 6 — Honest Structural Missingness</w:t>
+      </w:r>
+    </w:p>
+    <w:p>
+      <w:pPr>
+        <w:spacing w:before="100" w:beforeAutospacing="1" w:after="100" w:afterAutospacing="1"/>
+        <w:rPr>
+          <w:sz w:val="24"/>
+          <w:szCs w:val="24"/>
+        </w:rPr>
+      </w:pPr>
+      <w:r>
+        <w:rPr>
+          <w:sz w:val="24"/>
+          <w:szCs w:val="24"/>
+        </w:rPr>
+        <w:t>Column 6 (follower_speed) is left untouched with its original NaN values. NaN here is not corruption — it is an honest signal that the data was structurally unavailable. No rear-facing RSU camera exists to fill it, and the ego-kinematics GRU-D was not designed to predict an independent trailing driver's behaviour. The downstream LSTM must handle this via masking.</w:t>
+      </w:r>
+    </w:p>
+    <w:p>
+      <w:pPr>
+        <w:spacing w:before="100" w:beforeAutospacing="1" w:after="100" w:afterAutospacing="1"/>
+        <w:rPr>
+          <w:sz w:val="24"/>
+          <w:szCs w:val="24"/>
+        </w:rPr>
+      </w:pPr>
+      <w:r>
+        <w:rPr>
+          <w:b/>
+          <w:bCs/>
+          <w:sz w:val="24"/>
+          <w:szCs w:val="24"/>
+        </w:rPr>
+        <w:t>Verification Logic</w:t>
+      </w:r>
+    </w:p>
+    <w:p>
+      <w:pPr>
+        <w:spacing w:before="100" w:beforeAutospacing="1" w:after="100" w:afterAutospacing="1"/>
+        <w:rPr>
+          <w:sz w:val="24"/>
+          <w:szCs w:val="24"/>
+        </w:rPr>
+      </w:pPr>
+      <w:r>
+        <w:rPr>
+          <w:sz w:val="24"/>
+          <w:szCs w:val="24"/>
+        </w:rPr>
+        <w:t>Ego columns 0-3 verified to contain zero NaN after integration — hard assertion, raises ValueError if violated. Columns 4, 5, 6 NaN counts reported honestly per file.</w:t>
+      </w:r>
+    </w:p>
+    <w:p>
+      <w:pPr>
+        <w:spacing w:before="100" w:beforeAutospacing="1" w:after="100" w:afterAutospacing="1"/>
+        <w:rPr>
+          <w:sz w:val="24"/>
+          <w:szCs w:val="24"/>
+        </w:rPr>
+      </w:pPr>
+      <w:r>
+        <w:rPr>
+          <w:b/>
+          <w:bCs/>
+          <w:sz w:val="24"/>
+          <w:szCs w:val="24"/>
+        </w:rPr>
+        <w:t>Results — 60/60 Files Processed</w:t>
+      </w:r>
+    </w:p>
+    <w:p>
+      <w:pPr>
+        <w:spacing w:before="60" w:after="80"/>
+        <w:jc w:val="both"/>
+      </w:pPr>
+      <w:r>
+        <w:drawing>
+          <wp:inline distT="0" distB="0" distL="0" distR="0" wp14:anchorId="697B65E3" wp14:editId="54072F62">
+            <wp:extent cx="5731510" cy="2378710"/>
+            <wp:effectExtent l="0" t="0" r="2540" b="2540"/>
+            <wp:docPr id="18151133" name="Picture 1"/>
+            <wp:cNvGraphicFramePr>
+              <a:graphicFrameLocks xmlns:a="http://schemas.openxmlformats.org/drawingml/2006/main" noChangeAspect="1"/>
+            </wp:cNvGraphicFramePr>
+            <a:graphic xmlns:a="http://schemas.openxmlformats.org/drawingml/2006/main">
+              <a:graphicData uri="http://schemas.openxmlformats.org/drawingml/2006/picture">
+                <pic:pic xmlns:pic="http://schemas.openxmlformats.org/drawingml/2006/picture">
+                  <pic:nvPicPr>
+                    <pic:cNvPr id="18151133" name=""/>
+                    <pic:cNvPicPr/>
+                  </pic:nvPicPr>
+                  <pic:blipFill>
+                    <a:blip r:embed="rId18"/>
+                    <a:stretch>
+                      <a:fillRect/>
+                    </a:stretch>
+                  </pic:blipFill>
+                  <pic:spPr>
+                    <a:xfrm>
+                      <a:off x="0" y="0"/>
+                      <a:ext cx="5731510" cy="2378710"/>
+                    </a:xfrm>
+                    <a:prstGeom prst="rect">
+                      <a:avLst/>
+                    </a:prstGeom>
+                  </pic:spPr>
+                </pic:pic>
+              </a:graphicData>
+            </a:graphic>
+          </wp:inline>
+        </w:drawing>
+      </w:r>
+    </w:p>
+    <w:p>
+      <w:pPr>
+        <w:spacing w:before="60" w:after="80"/>
+        <w:jc w:val="both"/>
+      </w:pPr>
+    </w:p>
+    <w:p>
+      <w:pPr>
+        <w:spacing w:before="60" w:after="80"/>
+        <w:jc w:val="both"/>
+      </w:pPr>
+    </w:p>
+    <w:p>
+      <w:pPr>
+        <w:spacing w:before="100" w:beforeAutospacing="1" w:after="100" w:afterAutospacing="1"/>
+        <w:rPr>
+          <w:sz w:val="24"/>
+          <w:szCs w:val="24"/>
+        </w:rPr>
+      </w:pPr>
+      <w:r>
+        <w:rPr>
+          <w:b/>
+          <w:bCs/>
+          <w:sz w:val="24"/>
+          <w:szCs w:val="24"/>
+        </w:rPr>
+        <w:t>Known Limitation — 0.7% Unrecoverable Blackout</w:t>
+      </w:r>
+    </w:p>
+    <w:p>
+      <w:pPr>
+        <w:spacing w:before="100" w:beforeAutospacing="1" w:after="100" w:afterAutospacing="1"/>
+        <w:rPr>
+          <w:sz w:val="24"/>
+          <w:szCs w:val="24"/>
+        </w:rPr>
+      </w:pPr>
+      <w:r>
+        <w:rPr>
+          <w:sz w:val="24"/>
+          <w:szCs w:val="24"/>
+        </w:rPr>
+        <w:t xml:space="preserve">Residual NaN in columns 4 and 5 (col4 always equals col5) represents windows where the RSU camera had zero detections across all 30 steps. The Kalman Filter cannot initialise without at least one observation. These windows report a 0.7% unrecoverable blackout rate. </w:t>
+      </w:r>
+      <w:r>
+        <w:rPr>
+          <w:sz w:val="24"/>
+          <w:szCs w:val="24"/>
+        </w:rPr>
+        <w:lastRenderedPageBreak/>
+        <w:t>Mean-filling was deliberately rejected — injecting a hallucinated leader speed when no sensor data exists would undermine the physical methodology. This is reported as an honest system limitation.</w:t>
+      </w:r>
+    </w:p>
+    <w:p>
+      <w:pPr>
+        <w:spacing w:before="100" w:beforeAutospacing="1" w:after="100" w:afterAutospacing="1"/>
+        <w:rPr>
+          <w:sz w:val="24"/>
+          <w:szCs w:val="24"/>
+        </w:rPr>
+      </w:pPr>
+      <w:r>
+        <w:rPr>
+          <w:b/>
+          <w:bCs/>
+          <w:sz w:val="24"/>
+          <w:szCs w:val="24"/>
+        </w:rPr>
+        <w:t>Final Dataset State After Step 9</w:t>
+      </w:r>
+    </w:p>
+    <w:p>
+      <w:pPr>
+        <w:spacing w:before="100" w:beforeAutospacing="1" w:after="100" w:afterAutospacing="1"/>
+        <w:rPr>
+          <w:sz w:val="24"/>
+          <w:szCs w:val="24"/>
+        </w:rPr>
+      </w:pPr>
+      <w:r>
+        <w:rPr>
+          <w:sz w:val="24"/>
+          <w:szCs w:val="24"/>
+        </w:rPr>
+        <w:t xml:space="preserve">Each </w:t>
+      </w:r>
+      <w:r>
+        <w:rPr>
+          <w:rFonts w:ascii="Courier New" w:hAnsi="Courier New" w:cs="Courier New"/>
+        </w:rPr>
+        <w:t>.npz</w:t>
+      </w:r>
+      <w:r>
+        <w:rPr>
+          <w:sz w:val="24"/>
+          <w:szCs w:val="24"/>
+        </w:rPr>
+        <w:t xml:space="preserve"> file in </w:t>
+      </w:r>
+      <w:r>
+        <w:rPr>
+          <w:rFonts w:ascii="Courier New" w:hAnsi="Courier New" w:cs="Courier New"/>
+        </w:rPr>
+        <w:t>data_corrupted/</w:t>
+      </w:r>
+      <w:r>
+        <w:rPr>
+          <w:sz w:val="24"/>
+          <w:szCs w:val="24"/>
+        </w:rPr>
+        <w:t xml:space="preserve"> now contains eight arrays:</w:t>
+      </w:r>
+    </w:p>
+    <w:p>
+      <w:pPr>
+        <w:tabs>
+          <w:tab w:val="left" w:pos="916"/>
+          <w:tab w:val="left" w:pos="1832"/>
+          <w:tab w:val="left" w:pos="2748"/>
+          <w:tab w:val="left" w:pos="3664"/>
+          <w:tab w:val="left" w:pos="4580"/>
+          <w:tab w:val="left" w:pos="5496"/>
+          <w:tab w:val="left" w:pos="6412"/>
+          <w:tab w:val="left" w:pos="7328"/>
+          <w:tab w:val="left" w:pos="8244"/>
+          <w:tab w:val="left" w:pos="9160"/>
+          <w:tab w:val="left" w:pos="10076"/>
+          <w:tab w:val="left" w:pos="10992"/>
+          <w:tab w:val="left" w:pos="11908"/>
+          <w:tab w:val="left" w:pos="12824"/>
+          <w:tab w:val="left" w:pos="13740"/>
+          <w:tab w:val="left" w:pos="14656"/>
+        </w:tabs>
+        <w:rPr>
+          <w:rFonts w:ascii="var(--font-mono)" w:hAnsi="var(--font-mono)" w:cs="Courier New"/>
+          <w:color w:val="14181F"/>
+        </w:rPr>
+      </w:pPr>
+      <w:r>
+        <w:rPr>
+          <w:rFonts w:ascii="var(--font-mono)" w:hAnsi="var(--font-mono)" w:cs="Courier New"/>
+          <w:color w:val="14181F"/>
+        </w:rPr>
+        <w:t>X_gt              (N, 30, 7)  — ground truth, never modified</w:t>
+      </w:r>
+    </w:p>
+    <w:p>
+      <w:pPr>
+        <w:tabs>
+          <w:tab w:val="left" w:pos="916"/>
+          <w:tab w:val="left" w:pos="1832"/>
+          <w:tab w:val="left" w:pos="2748"/>
+          <w:tab w:val="left" w:pos="3664"/>
+          <w:tab w:val="left" w:pos="4580"/>
+          <w:tab w:val="left" w:pos="5496"/>
+          <w:tab w:val="left" w:pos="6412"/>
+          <w:tab w:val="left" w:pos="7328"/>
+          <w:tab w:val="left" w:pos="8244"/>
+          <w:tab w:val="left" w:pos="9160"/>
+          <w:tab w:val="left" w:pos="10076"/>
+          <w:tab w:val="left" w:pos="10992"/>
+          <w:tab w:val="left" w:pos="11908"/>
+          <w:tab w:val="left" w:pos="12824"/>
+          <w:tab w:val="left" w:pos="13740"/>
+          <w:tab w:val="left" w:pos="14656"/>
+        </w:tabs>
+        <w:rPr>
+          <w:rFonts w:ascii="var(--font-mono)" w:hAnsi="var(--font-mono)" w:cs="Courier New"/>
+          <w:color w:val="14181F"/>
+        </w:rPr>
+      </w:pPr>
+      <w:r>
+        <w:rPr>
+          <w:rFonts w:ascii="var(--font-mono)" w:hAnsi="var(--font-mono)" w:cs="Courier New"/>
+          <w:color w:val="14181F"/>
+        </w:rPr>
+        <w:t>Y                 (N, 50, 2)  — trajectory labels</w:t>
+      </w:r>
+    </w:p>
+    <w:p>
+      <w:pPr>
+        <w:tabs>
+          <w:tab w:val="left" w:pos="916"/>
+          <w:tab w:val="left" w:pos="1832"/>
+          <w:tab w:val="left" w:pos="2748"/>
+          <w:tab w:val="left" w:pos="3664"/>
+          <w:tab w:val="left" w:pos="4580"/>
+          <w:tab w:val="left" w:pos="5496"/>
+          <w:tab w:val="left" w:pos="6412"/>
+          <w:tab w:val="left" w:pos="7328"/>
+          <w:tab w:val="left" w:pos="8244"/>
+          <w:tab w:val="left" w:pos="9160"/>
+          <w:tab w:val="left" w:pos="10076"/>
+          <w:tab w:val="left" w:pos="10992"/>
+          <w:tab w:val="left" w:pos="11908"/>
+          <w:tab w:val="left" w:pos="12824"/>
+          <w:tab w:val="left" w:pos="13740"/>
+          <w:tab w:val="left" w:pos="14656"/>
+        </w:tabs>
+        <w:rPr>
+          <w:rFonts w:ascii="var(--font-mono)" w:hAnsi="var(--font-mono)" w:cs="Courier New"/>
+          <w:color w:val="14181F"/>
+        </w:rPr>
+      </w:pPr>
+      <w:r>
+        <w:rPr>
+          <w:rFonts w:ascii="var(--font-mono)" w:hAnsi="var(--font-mono)" w:cs="Courier New"/>
+          <w:color w:val="14181F"/>
+        </w:rPr>
+        <w:t>X_corrupted       (N, 30, 7)  — SFM + TCM applied</w:t>
+      </w:r>
+    </w:p>
+    <w:p>
+      <w:pPr>
+        <w:tabs>
+          <w:tab w:val="left" w:pos="916"/>
+          <w:tab w:val="left" w:pos="1832"/>
+          <w:tab w:val="left" w:pos="2748"/>
+          <w:tab w:val="left" w:pos="3664"/>
+          <w:tab w:val="left" w:pos="4580"/>
+          <w:tab w:val="left" w:pos="5496"/>
+          <w:tab w:val="left" w:pos="6412"/>
+          <w:tab w:val="left" w:pos="7328"/>
+          <w:tab w:val="left" w:pos="8244"/>
+          <w:tab w:val="left" w:pos="9160"/>
+          <w:tab w:val="left" w:pos="10076"/>
+          <w:tab w:val="left" w:pos="10992"/>
+          <w:tab w:val="left" w:pos="11908"/>
+          <w:tab w:val="left" w:pos="12824"/>
+          <w:tab w:val="left" w:pos="13740"/>
+          <w:tab w:val="left" w:pos="14656"/>
+        </w:tabs>
+        <w:rPr>
+          <w:rFonts w:ascii="var(--font-mono)" w:hAnsi="var(--font-mono)" w:cs="Courier New"/>
+          <w:color w:val="14181F"/>
+        </w:rPr>
+      </w:pPr>
+      <w:r>
+        <w:rPr>
+          <w:rFonts w:ascii="var(--font-mono)" w:hAnsi="var(--font-mono)" w:cs="Courier New"/>
+          <w:color w:val="14181F"/>
+        </w:rPr>
+        <w:t>X_mask            (N, 30, 7)  — combined observation mask</w:t>
+      </w:r>
+    </w:p>
+    <w:p>
+      <w:pPr>
+        <w:tabs>
+          <w:tab w:val="left" w:pos="916"/>
+          <w:tab w:val="left" w:pos="1832"/>
+          <w:tab w:val="left" w:pos="2748"/>
+          <w:tab w:val="left" w:pos="3664"/>
+          <w:tab w:val="left" w:pos="4580"/>
+          <w:tab w:val="left" w:pos="5496"/>
+          <w:tab w:val="left" w:pos="6412"/>
+          <w:tab w:val="left" w:pos="7328"/>
+          <w:tab w:val="left" w:pos="8244"/>
+          <w:tab w:val="left" w:pos="9160"/>
+          <w:tab w:val="left" w:pos="10076"/>
+          <w:tab w:val="left" w:pos="10992"/>
+          <w:tab w:val="left" w:pos="11908"/>
+          <w:tab w:val="left" w:pos="12824"/>
+          <w:tab w:val="left" w:pos="13740"/>
+          <w:tab w:val="left" w:pos="14656"/>
+        </w:tabs>
+        <w:rPr>
+          <w:rFonts w:ascii="var(--font-mono)" w:hAnsi="var(--font-mono)" w:cs="Courier New"/>
+          <w:color w:val="14181F"/>
+        </w:rPr>
+      </w:pPr>
+      <w:r>
+        <w:rPr>
+          <w:rFonts w:ascii="var(--font-mono)" w:hAnsi="var(--font-mono)" w:cs="Courier New"/>
+          <w:color w:val="14181F"/>
+        </w:rPr>
+        <w:t>leader_meta       (N, 30)     — leader type strings</w:t>
+      </w:r>
+    </w:p>
+    <w:p>
+      <w:pPr>
+        <w:tabs>
+          <w:tab w:val="left" w:pos="916"/>
+          <w:tab w:val="left" w:pos="1832"/>
+          <w:tab w:val="left" w:pos="2748"/>
+          <w:tab w:val="left" w:pos="3664"/>
+          <w:tab w:val="left" w:pos="4580"/>
+          <w:tab w:val="left" w:pos="5496"/>
+          <w:tab w:val="left" w:pos="6412"/>
+          <w:tab w:val="left" w:pos="7328"/>
+          <w:tab w:val="left" w:pos="8244"/>
+          <w:tab w:val="left" w:pos="9160"/>
+          <w:tab w:val="left" w:pos="10076"/>
+          <w:tab w:val="left" w:pos="10992"/>
+          <w:tab w:val="left" w:pos="11908"/>
+          <w:tab w:val="left" w:pos="12824"/>
+          <w:tab w:val="left" w:pos="13740"/>
+          <w:tab w:val="left" w:pos="14656"/>
+        </w:tabs>
+        <w:rPr>
+          <w:rFonts w:ascii="var(--font-mono)" w:hAnsi="var(--font-mono)" w:cs="Courier New"/>
+          <w:color w:val="14181F"/>
+        </w:rPr>
+      </w:pPr>
+      <w:r>
+        <w:rPr>
+          <w:rFonts w:ascii="var(--font-mono)" w:hAnsi="var(--font-mono)" w:cs="Courier New"/>
+          <w:color w:val="14181F"/>
+        </w:rPr>
+        <w:t>follower_meta     (N, 30)     — follower type strings</w:t>
+      </w:r>
+    </w:p>
+    <w:p>
+      <w:pPr>
+        <w:tabs>
+          <w:tab w:val="left" w:pos="916"/>
+          <w:tab w:val="left" w:pos="1832"/>
+          <w:tab w:val="left" w:pos="2748"/>
+          <w:tab w:val="left" w:pos="3664"/>
+          <w:tab w:val="left" w:pos="4580"/>
+          <w:tab w:val="left" w:pos="5496"/>
+          <w:tab w:val="left" w:pos="6412"/>
+          <w:tab w:val="left" w:pos="7328"/>
+          <w:tab w:val="left" w:pos="8244"/>
+          <w:tab w:val="left" w:pos="9160"/>
+          <w:tab w:val="left" w:pos="10076"/>
+          <w:tab w:val="left" w:pos="10992"/>
+          <w:tab w:val="left" w:pos="11908"/>
+          <w:tab w:val="left" w:pos="12824"/>
+          <w:tab w:val="left" w:pos="13740"/>
+          <w:tab w:val="left" w:pos="14656"/>
+        </w:tabs>
+        <w:rPr>
+          <w:rFonts w:ascii="var(--font-mono)" w:hAnsi="var(--font-mono)" w:cs="Courier New"/>
+          <w:color w:val="14181F"/>
+        </w:rPr>
+      </w:pPr>
+      <w:r>
+        <w:rPr>
+          <w:rFonts w:ascii="var(--font-mono)" w:hAnsi="var(--font-mono)" w:cs="Courier New"/>
+          <w:color w:val="14181F"/>
+        </w:rPr>
+        <w:t>rsu_obs           (N, 30, 2)  — noisy RSU camera observations</w:t>
+      </w:r>
+    </w:p>
+    <w:p>
+      <w:pPr>
+        <w:tabs>
+          <w:tab w:val="left" w:pos="916"/>
+          <w:tab w:val="left" w:pos="1832"/>
+          <w:tab w:val="left" w:pos="2748"/>
+          <w:tab w:val="left" w:pos="3664"/>
+          <w:tab w:val="left" w:pos="4580"/>
+          <w:tab w:val="left" w:pos="5496"/>
+          <w:tab w:val="left" w:pos="6412"/>
+          <w:tab w:val="left" w:pos="7328"/>
+          <w:tab w:val="left" w:pos="8244"/>
+          <w:tab w:val="left" w:pos="9160"/>
+          <w:tab w:val="left" w:pos="10076"/>
+          <w:tab w:val="left" w:pos="10992"/>
+          <w:tab w:val="left" w:pos="11908"/>
+          <w:tab w:val="left" w:pos="12824"/>
+          <w:tab w:val="left" w:pos="13740"/>
+          <w:tab w:val="left" w:pos="14656"/>
+        </w:tabs>
+        <w:rPr>
+          <w:rFonts w:ascii="var(--font-mono)" w:hAnsi="var(--font-mono)" w:cs="Courier New"/>
+          <w:color w:val="14181F"/>
+        </w:rPr>
+      </w:pPr>
+      <w:r>
+        <w:rPr>
+          <w:rFonts w:ascii="var(--font-mono)" w:hAnsi="var(--font-mono)" w:cs="Courier New"/>
+          <w:color w:val="14181F"/>
+        </w:rPr>
+        <w:t>X_ch1_imputed     (N, 30, 7)  — after Channel 1 Kalman Filter</w:t>
+      </w:r>
+    </w:p>
+    <w:p>
+      <w:pPr>
+        <w:tabs>
+          <w:tab w:val="left" w:pos="916"/>
+          <w:tab w:val="left" w:pos="1832"/>
+          <w:tab w:val="left" w:pos="2748"/>
+          <w:tab w:val="left" w:pos="3664"/>
+          <w:tab w:val="left" w:pos="4580"/>
+          <w:tab w:val="left" w:pos="5496"/>
+          <w:tab w:val="left" w:pos="6412"/>
+          <w:tab w:val="left" w:pos="7328"/>
+          <w:tab w:val="left" w:pos="8244"/>
+          <w:tab w:val="left" w:pos="9160"/>
+          <w:tab w:val="left" w:pos="10076"/>
+          <w:tab w:val="left" w:pos="10992"/>
+          <w:tab w:val="left" w:pos="11908"/>
+          <w:tab w:val="left" w:pos="12824"/>
+          <w:tab w:val="left" w:pos="13740"/>
+          <w:tab w:val="left" w:pos="14656"/>
+        </w:tabs>
+        <w:rPr>
+          <w:rFonts w:ascii="var(--font-mono)" w:hAnsi="var(--font-mono)" w:cs="Courier New"/>
+          <w:color w:val="14181F"/>
+        </w:rPr>
+      </w:pPr>
+      <w:r>
+        <w:rPr>
+          <w:rFonts w:ascii="var(--font-mono)" w:hAnsi="var(--font-mono)" w:cs="Courier New"/>
+          <w:color w:val="14181F"/>
+        </w:rPr>
+        <w:t>X_fully_imputed   (N, 30, 7)  — after Channel 1 + Channel 2</w:t>
+      </w:r>
+    </w:p>
+    <w:p>
+      <w:pPr>
+        <w:spacing w:before="100" w:beforeAutospacing="1" w:after="100" w:afterAutospacing="1"/>
+        <w:rPr>
+          <w:sz w:val="24"/>
+          <w:szCs w:val="24"/>
+        </w:rPr>
+      </w:pPr>
+      <w:r>
+        <w:rPr>
+          <w:rFonts w:ascii="Courier New" w:hAnsi="Courier New" w:cs="Courier New"/>
+        </w:rPr>
+        <w:t>X_fully_imputed</w:t>
+      </w:r>
+      <w:r>
+        <w:rPr>
+          <w:sz w:val="24"/>
+          <w:szCs w:val="24"/>
+        </w:rPr>
+        <w:t xml:space="preserve"> is the final model input for Step 10 LSTM training.</w:t>
+      </w:r>
+    </w:p>
+    <w:p>
+      <w:pPr>
+        <w:spacing w:before="60" w:after="80"/>
+        <w:jc w:val="both"/>
+      </w:pPr>
+      <w:r>
+        <w:drawing>
+          <wp:inline distT="0" distB="0" distL="0" distR="0" wp14:anchorId="0D5D9FC4" wp14:editId="0A339665">
+            <wp:extent cx="5731510" cy="5144770"/>
+            <wp:effectExtent l="0" t="0" r="2540" b="0"/>
+            <wp:docPr id="519776265" name="Picture 1"/>
+            <wp:cNvGraphicFramePr>
+              <a:graphicFrameLocks xmlns:a="http://schemas.openxmlformats.org/drawingml/2006/main" noChangeAspect="1"/>
+            </wp:cNvGraphicFramePr>
+            <a:graphic xmlns:a="http://schemas.openxmlformats.org/drawingml/2006/main">
+              <a:graphicData uri="http://schemas.openxmlformats.org/drawingml/2006/picture">
+                <pic:pic xmlns:pic="http://schemas.openxmlformats.org/drawingml/2006/picture">
+                  <pic:nvPicPr>
+                    <pic:cNvPr id="519776265" name=""/>
+                    <pic:cNvPicPr/>
+                  </pic:nvPicPr>
+                  <pic:blipFill>
+                    <a:blip r:embed="rId19"/>
+                    <a:stretch>
+                      <a:fillRect/>
+                    </a:stretch>
+                  </pic:blipFill>
+                  <pic:spPr>
+                    <a:xfrm>
+                      <a:off x="0" y="0"/>
+                      <a:ext cx="5731510" cy="5144770"/>
+                    </a:xfrm>
+                    <a:prstGeom prst="rect">
+                      <a:avLst/>
+                    </a:prstGeom>
+                  </pic:spPr>
+                </pic:pic>
+              </a:graphicData>
+            </a:graphic>
+          </wp:inline>
+        </w:drawing>
+      </w:r>
+    </w:p>
     <w:sectPr>
       <w:pgSz w:w="11906" w:h="16838"/>
       <w:pgMar w:top="1440" w:right="1440" w:bottom="1440" w:left="1440" w:header="708" w:footer="708" w:gutter="0"/>
@@ -6931,11 +8023,127 @@
       </w:pPr>
     </w:lvl>
   </w:abstractNum>
+  <w:abstractNum w:abstractNumId="1" w15:restartNumberingAfterBreak="0">
+    <w:nsid w:val="4D3D5838"/>
+    <w:multiLevelType w:val="multilevel"/>
+    <w:tmpl w:val="30B4DEBC"/>
+    <w:lvl w:ilvl="0">
+      <w:start w:val="1"/>
+      <w:numFmt w:val="decimal"/>
+      <w:lvlText w:val="%1."/>
+      <w:lvlJc w:val="left"/>
+      <w:pPr>
+        <w:tabs>
+          <w:tab w:val="num" w:pos="720"/>
+        </w:tabs>
+        <w:ind w:left="720" w:hanging="360"/>
+      </w:pPr>
+    </w:lvl>
+    <w:lvl w:ilvl="1" w:tentative="1">
+      <w:start w:val="1"/>
+      <w:numFmt w:val="decimal"/>
+      <w:lvlText w:val="%2."/>
+      <w:lvlJc w:val="left"/>
+      <w:pPr>
+        <w:tabs>
+          <w:tab w:val="num" w:pos="1440"/>
+        </w:tabs>
+        <w:ind w:left="1440" w:hanging="360"/>
+      </w:pPr>
+    </w:lvl>
+    <w:lvl w:ilvl="2" w:tentative="1">
+      <w:start w:val="1"/>
+      <w:numFmt w:val="decimal"/>
+      <w:lvlText w:val="%3."/>
+      <w:lvlJc w:val="left"/>
+      <w:pPr>
+        <w:tabs>
+          <w:tab w:val="num" w:pos="2160"/>
+        </w:tabs>
+        <w:ind w:left="2160" w:hanging="360"/>
+      </w:pPr>
+    </w:lvl>
+    <w:lvl w:ilvl="3" w:tentative="1">
+      <w:start w:val="1"/>
+      <w:numFmt w:val="decimal"/>
+      <w:lvlText w:val="%4."/>
+      <w:lvlJc w:val="left"/>
+      <w:pPr>
+        <w:tabs>
+          <w:tab w:val="num" w:pos="2880"/>
+        </w:tabs>
+        <w:ind w:left="2880" w:hanging="360"/>
+      </w:pPr>
+    </w:lvl>
+    <w:lvl w:ilvl="4" w:tentative="1">
+      <w:start w:val="1"/>
+      <w:numFmt w:val="decimal"/>
+      <w:lvlText w:val="%5."/>
+      <w:lvlJc w:val="left"/>
+      <w:pPr>
+        <w:tabs>
+          <w:tab w:val="num" w:pos="3600"/>
+        </w:tabs>
+        <w:ind w:left="3600" w:hanging="360"/>
+      </w:pPr>
+    </w:lvl>
+    <w:lvl w:ilvl="5" w:tentative="1">
+      <w:start w:val="1"/>
+      <w:numFmt w:val="decimal"/>
+      <w:lvlText w:val="%6."/>
+      <w:lvlJc w:val="left"/>
+      <w:pPr>
+        <w:tabs>
+          <w:tab w:val="num" w:pos="4320"/>
+        </w:tabs>
+        <w:ind w:left="4320" w:hanging="360"/>
+      </w:pPr>
+    </w:lvl>
+    <w:lvl w:ilvl="6" w:tentative="1">
+      <w:start w:val="1"/>
+      <w:numFmt w:val="decimal"/>
+      <w:lvlText w:val="%7."/>
+      <w:lvlJc w:val="left"/>
+      <w:pPr>
+        <w:tabs>
+          <w:tab w:val="num" w:pos="5040"/>
+        </w:tabs>
+        <w:ind w:left="5040" w:hanging="360"/>
+      </w:pPr>
+    </w:lvl>
+    <w:lvl w:ilvl="7" w:tentative="1">
+      <w:start w:val="1"/>
+      <w:numFmt w:val="decimal"/>
+      <w:lvlText w:val="%8."/>
+      <w:lvlJc w:val="left"/>
+      <w:pPr>
+        <w:tabs>
+          <w:tab w:val="num" w:pos="5760"/>
+        </w:tabs>
+        <w:ind w:left="5760" w:hanging="360"/>
+      </w:pPr>
+    </w:lvl>
+    <w:lvl w:ilvl="8" w:tentative="1">
+      <w:start w:val="1"/>
+      <w:numFmt w:val="decimal"/>
+      <w:lvlText w:val="%9."/>
+      <w:lvlJc w:val="left"/>
+      <w:pPr>
+        <w:tabs>
+          <w:tab w:val="num" w:pos="6480"/>
+        </w:tabs>
+        <w:ind w:left="6480" w:hanging="360"/>
+      </w:pPr>
+    </w:lvl>
+  </w:abstractNum>
   <w:num w:numId="1" w16cid:durableId="466314816">
     <w:abstractNumId w:val="0"/>
     <w:lvlOverride w:ilvl="0">
       <w:startOverride w:val="1"/>
     </w:lvlOverride>
+  </w:num>
+  <w:num w:numId="2" w16cid:durableId="773598032">
+    <w:abstractNumId w:val="1"/>
   </w:num>
 </w:numbering>
 </file>
@@ -7418,6 +8626,7 @@
   <w:style w:type="character" w:default="1" w:styleId="DefaultParagraphFont">
     <w:name w:val="Default Paragraph Font"/>
     <w:uiPriority w:val="1"/>
+    <w:semiHidden/>
     <w:unhideWhenUsed/>
   </w:style>
   <w:style w:type="table" w:default="1" w:styleId="TableNormal">

</xml_diff>